<commit_message>
update 5.1 Thiết kế CSDL
</commit_message>
<xml_diff>
--- a/Báo Cáo DATN_GD1.docx
+++ b/Báo Cáo DATN_GD1.docx
@@ -965,8 +965,6 @@
         </w:rPr>
         <w:t xml:space="preserve">6 </w:t>
       </w:r>
-      <w:bookmarkStart w:id="113" w:name="_GoBack"/>
-      <w:bookmarkEnd w:id="113"/>
       <w:r>
         <w:rPr>
           <w:rFonts w:hint="default" w:ascii="Times New Roman" w:hAnsi="Times New Roman" w:cs="Times New Roman"/>
@@ -1921,8 +1919,8 @@
     </w:p>
     <w:p/>
     <w:p>
-      <w:bookmarkStart w:id="0" w:name="_Toc8793"/>
-      <w:bookmarkStart w:id="1" w:name="_Toc30612"/>
+      <w:bookmarkStart w:id="0" w:name="_Toc30612"/>
+      <w:bookmarkStart w:id="1" w:name="_Toc8793"/>
       <w:r>
         <w:br w:type="page"/>
       </w:r>
@@ -1934,8 +1932,8 @@
         <w:jc w:val="center"/>
         <w:outlineLvl w:val="0"/>
       </w:pPr>
-      <w:bookmarkStart w:id="2" w:name="_Toc30282"/>
-      <w:bookmarkStart w:id="3" w:name="_Toc29598"/>
+      <w:bookmarkStart w:id="2" w:name="_Toc29598"/>
+      <w:bookmarkStart w:id="3" w:name="_Toc30282"/>
       <w:bookmarkStart w:id="4" w:name="_Toc5053"/>
       <w:r>
         <w:t>LỜI MỞ ĐẦU</w:t>
@@ -2110,13 +2108,13 @@
         </w:rPr>
         <w:br w:type="page"/>
       </w:r>
-      <w:bookmarkStart w:id="5" w:name="_Toc1121"/>
-      <w:bookmarkStart w:id="6" w:name="_Toc26225"/>
-      <w:bookmarkStart w:id="7" w:name="_Toc29430"/>
-      <w:bookmarkStart w:id="8" w:name="_Toc22367"/>
+      <w:bookmarkStart w:id="5" w:name="_Toc26225"/>
+      <w:bookmarkStart w:id="6" w:name="_Toc1121"/>
+      <w:bookmarkStart w:id="7" w:name="_Toc22367"/>
+      <w:bookmarkStart w:id="8" w:name="_Toc22668"/>
       <w:bookmarkStart w:id="9" w:name="_Toc9097"/>
-      <w:bookmarkStart w:id="10" w:name="_Toc22668"/>
-      <w:bookmarkStart w:id="11" w:name="_Toc32393"/>
+      <w:bookmarkStart w:id="10" w:name="_Toc32393"/>
+      <w:bookmarkStart w:id="11" w:name="_Toc29430"/>
       <w:r>
         <w:rPr>
           <w:rFonts w:hint="default" w:ascii="Times New Roman" w:hAnsi="Times New Roman" w:cs="Times New Roman"/>
@@ -2374,13 +2372,13 @@
           <w:lang w:val="en-US"/>
         </w:rPr>
       </w:pPr>
-      <w:bookmarkStart w:id="12" w:name="_Toc3863"/>
-      <w:bookmarkStart w:id="13" w:name="_Toc16751"/>
-      <w:bookmarkStart w:id="14" w:name="_Toc10975"/>
-      <w:bookmarkStart w:id="15" w:name="_Toc20680"/>
-      <w:bookmarkStart w:id="16" w:name="_Toc20597"/>
-      <w:bookmarkStart w:id="17" w:name="_Toc20206"/>
-      <w:bookmarkStart w:id="18" w:name="_Toc12120"/>
+      <w:bookmarkStart w:id="12" w:name="_Toc12120"/>
+      <w:bookmarkStart w:id="13" w:name="_Toc3863"/>
+      <w:bookmarkStart w:id="14" w:name="_Toc20597"/>
+      <w:bookmarkStart w:id="15" w:name="_Toc10975"/>
+      <w:bookmarkStart w:id="16" w:name="_Toc20206"/>
+      <w:bookmarkStart w:id="17" w:name="_Toc16751"/>
+      <w:bookmarkStart w:id="18" w:name="_Toc20680"/>
       <w:r>
         <w:rPr>
           <w:lang w:val="en-US"/>
@@ -2425,13 +2423,13 @@
           <w:lang w:val="en-US"/>
         </w:rPr>
       </w:pPr>
-      <w:bookmarkStart w:id="19" w:name="_Toc15697"/>
-      <w:bookmarkStart w:id="20" w:name="_Toc19334"/>
-      <w:bookmarkStart w:id="21" w:name="_Toc9498"/>
-      <w:bookmarkStart w:id="22" w:name="_Toc31649"/>
-      <w:bookmarkStart w:id="23" w:name="_Toc22756"/>
-      <w:bookmarkStart w:id="24" w:name="_Toc6002"/>
-      <w:bookmarkStart w:id="25" w:name="_Toc3781"/>
+      <w:bookmarkStart w:id="19" w:name="_Toc9498"/>
+      <w:bookmarkStart w:id="20" w:name="_Toc3781"/>
+      <w:bookmarkStart w:id="21" w:name="_Toc6002"/>
+      <w:bookmarkStart w:id="22" w:name="_Toc15697"/>
+      <w:bookmarkStart w:id="23" w:name="_Toc19334"/>
+      <w:bookmarkStart w:id="24" w:name="_Toc22756"/>
+      <w:bookmarkStart w:id="25" w:name="_Toc31649"/>
       <w:r>
         <w:rPr>
           <w:lang w:val="en-US"/>
@@ -2473,13 +2471,13 @@
         <w:spacing w:line="360" w:lineRule="auto"/>
         <w:outlineLvl w:val="0"/>
       </w:pPr>
-      <w:bookmarkStart w:id="26" w:name="_Toc6418"/>
-      <w:bookmarkStart w:id="27" w:name="_Toc25008"/>
-      <w:bookmarkStart w:id="28" w:name="_Toc13047"/>
-      <w:bookmarkStart w:id="29" w:name="_Toc20874"/>
-      <w:bookmarkStart w:id="30" w:name="_Toc19053"/>
-      <w:bookmarkStart w:id="31" w:name="_Toc10588"/>
-      <w:bookmarkStart w:id="32" w:name="_Toc2725"/>
+      <w:bookmarkStart w:id="26" w:name="_Toc25008"/>
+      <w:bookmarkStart w:id="27" w:name="_Toc13047"/>
+      <w:bookmarkStart w:id="28" w:name="_Toc20874"/>
+      <w:bookmarkStart w:id="29" w:name="_Toc10588"/>
+      <w:bookmarkStart w:id="30" w:name="_Toc2725"/>
+      <w:bookmarkStart w:id="31" w:name="_Toc19053"/>
+      <w:bookmarkStart w:id="32" w:name="_Toc6418"/>
       <w:r>
         <w:t>PHẦN 1 – GIỚI THIỆU ĐỀ TÀI</w:t>
       </w:r>
@@ -2681,13 +2679,13 @@
         <w:spacing w:line="360" w:lineRule="auto"/>
         <w:outlineLvl w:val="0"/>
       </w:pPr>
-      <w:bookmarkStart w:id="33" w:name="_Toc22866"/>
-      <w:bookmarkStart w:id="34" w:name="_Toc30129"/>
-      <w:bookmarkStart w:id="35" w:name="_Toc11364"/>
-      <w:bookmarkStart w:id="36" w:name="_Toc14684"/>
+      <w:bookmarkStart w:id="33" w:name="_Toc11364"/>
+      <w:bookmarkStart w:id="34" w:name="_Toc22866"/>
+      <w:bookmarkStart w:id="35" w:name="_Toc30129"/>
+      <w:bookmarkStart w:id="36" w:name="_Toc14718"/>
       <w:bookmarkStart w:id="37" w:name="_Toc27649"/>
-      <w:bookmarkStart w:id="38" w:name="_Toc9709"/>
-      <w:bookmarkStart w:id="39" w:name="_Toc14718"/>
+      <w:bookmarkStart w:id="38" w:name="_Toc14684"/>
+      <w:bookmarkStart w:id="39" w:name="_Toc9709"/>
       <w:r>
         <w:t>PHẦN 2 – KHẢO SÁT YÊU CẦU</w:t>
       </w:r>
@@ -2813,8 +2811,8 @@
         </w:rPr>
       </w:pPr>
       <w:bookmarkStart w:id="40" w:name="_Toc26269"/>
-      <w:bookmarkStart w:id="41" w:name="_Toc32181"/>
-      <w:bookmarkStart w:id="42" w:name="_Toc31548"/>
+      <w:bookmarkStart w:id="41" w:name="_Toc31548"/>
+      <w:bookmarkStart w:id="42" w:name="_Toc32181"/>
       <w:r>
         <w:rPr>
           <w:rFonts w:hint="default" w:ascii="Times New Roman" w:hAnsi="Times New Roman" w:eastAsia="SimSun" w:cs="Times New Roman"/>
@@ -5481,9 +5479,9 @@
           <w:lang w:val="en-US"/>
         </w:rPr>
       </w:pPr>
-      <w:bookmarkStart w:id="43" w:name="_Toc15410"/>
-      <w:bookmarkStart w:id="44" w:name="_Toc422"/>
-      <w:bookmarkStart w:id="45" w:name="_Toc13435"/>
+      <w:bookmarkStart w:id="43" w:name="_Toc13435"/>
+      <w:bookmarkStart w:id="44" w:name="_Toc15410"/>
+      <w:bookmarkStart w:id="45" w:name="_Toc422"/>
       <w:r>
         <w:rPr>
           <w:rFonts w:hint="default" w:ascii="Times New Roman" w:hAnsi="Times New Roman" w:eastAsia="SimSun" w:cs="Times New Roman"/>
@@ -6403,11 +6401,11 @@
         <w:pStyle w:val="2"/>
         <w:spacing w:line="360" w:lineRule="auto"/>
       </w:pPr>
-      <w:bookmarkStart w:id="46" w:name="_Toc19543"/>
-      <w:bookmarkStart w:id="47" w:name="_Toc10683"/>
+      <w:bookmarkStart w:id="46" w:name="_Toc10683"/>
+      <w:bookmarkStart w:id="47" w:name="_Toc19543"/>
       <w:bookmarkStart w:id="48" w:name="_Toc19710"/>
-      <w:bookmarkStart w:id="49" w:name="_Toc15986"/>
-      <w:bookmarkStart w:id="50" w:name="_Toc8363"/>
+      <w:bookmarkStart w:id="49" w:name="_Toc8363"/>
+      <w:bookmarkStart w:id="50" w:name="_Toc15986"/>
       <w:bookmarkStart w:id="51" w:name="_Toc20135"/>
       <w:bookmarkStart w:id="52" w:name="_Toc12983"/>
       <w:r>
@@ -7205,9 +7203,9 @@
           <w:lang w:val="en-US"/>
         </w:rPr>
       </w:pPr>
-      <w:bookmarkStart w:id="56" w:name="_Toc22787"/>
-      <w:bookmarkStart w:id="57" w:name="_Toc4435"/>
-      <w:bookmarkStart w:id="58" w:name="_Toc26304"/>
+      <w:bookmarkStart w:id="56" w:name="_Toc26304"/>
+      <w:bookmarkStart w:id="57" w:name="_Toc22787"/>
+      <w:bookmarkStart w:id="58" w:name="_Toc4435"/>
       <w:r>
         <w:rPr>
           <w:rFonts w:hint="default" w:ascii="Times New Roman" w:hAnsi="Times New Roman" w:eastAsia="SimSun" w:cs="Times New Roman"/>
@@ -7304,12 +7302,12 @@
         <w:pStyle w:val="2"/>
         <w:spacing w:line="360" w:lineRule="auto"/>
       </w:pPr>
-      <w:bookmarkStart w:id="59" w:name="_Toc872"/>
+      <w:bookmarkStart w:id="59" w:name="_Toc684"/>
       <w:bookmarkStart w:id="60" w:name="_Toc24143"/>
-      <w:bookmarkStart w:id="61" w:name="_Toc19969"/>
-      <w:bookmarkStart w:id="62" w:name="_Toc684"/>
-      <w:bookmarkStart w:id="63" w:name="_Toc15615"/>
-      <w:bookmarkStart w:id="64" w:name="_Toc11824"/>
+      <w:bookmarkStart w:id="61" w:name="_Toc872"/>
+      <w:bookmarkStart w:id="62" w:name="_Toc11824"/>
+      <w:bookmarkStart w:id="63" w:name="_Toc19969"/>
+      <w:bookmarkStart w:id="64" w:name="_Toc15615"/>
       <w:r>
         <w:t>PHẦN 4 – THIẾT KẾ HỆ THỐNG</w:t>
       </w:r>
@@ -11966,13 +11964,13 @@
         <w:pStyle w:val="2"/>
         <w:spacing w:line="360" w:lineRule="auto"/>
       </w:pPr>
-      <w:bookmarkStart w:id="71" w:name="_Toc31959"/>
-      <w:bookmarkStart w:id="72" w:name="_Toc21144"/>
-      <w:bookmarkStart w:id="73" w:name="_Toc8276"/>
-      <w:bookmarkStart w:id="74" w:name="_Toc1424"/>
-      <w:bookmarkStart w:id="75" w:name="_Toc14361"/>
+      <w:bookmarkStart w:id="71" w:name="_Toc21144"/>
+      <w:bookmarkStart w:id="72" w:name="_Toc8276"/>
+      <w:bookmarkStart w:id="73" w:name="_Toc1424"/>
+      <w:bookmarkStart w:id="74" w:name="_Toc31959"/>
+      <w:bookmarkStart w:id="75" w:name="_Toc23813"/>
       <w:bookmarkStart w:id="76" w:name="_Toc29185"/>
-      <w:bookmarkStart w:id="77" w:name="_Toc23813"/>
+      <w:bookmarkStart w:id="77" w:name="_Toc14361"/>
       <w:r>
         <w:t>PHẦN 5 – THỰC HIỆN DỰ ÁN</w:t>
       </w:r>
@@ -11986,25 +11984,1537 @@
     </w:p>
     <w:p>
       <w:pPr>
-        <w:spacing w:line="360" w:lineRule="auto"/>
-        <w:rPr>
-          <w:lang w:val="en-US"/>
-        </w:rPr>
-      </w:pPr>
-      <w:r>
-        <w:rPr>
-          <w:lang w:val="en-US"/>
-        </w:rPr>
-        <w:t>Thiết kế CSDL</w:t>
-      </w:r>
-    </w:p>
-    <w:p>
-      <w:pPr>
-        <w:spacing w:line="360" w:lineRule="auto"/>
-        <w:rPr>
-          <w:lang w:val="en-US"/>
-        </w:rPr>
-      </w:pPr>
+        <w:outlineLvl w:val="1"/>
+        <w:rPr>
+          <w:rFonts w:hint="default" w:eastAsia="SimSun" w:cs="Times New Roman"/>
+          <w:b/>
+          <w:bCs w:val="0"/>
+          <w:i w:val="0"/>
+          <w:iCs w:val="0"/>
+          <w:color w:val="000000"/>
+          <w:sz w:val="28"/>
+          <w:szCs w:val="28"/>
+          <w:u w:val="none"/>
+          <w:vertAlign w:val="baseline"/>
+          <w:lang w:val="en-US"/>
+        </w:rPr>
+      </w:pPr>
+      <w:r>
+        <w:rPr>
+          <w:rFonts w:hint="default" w:eastAsia="SimSun" w:cs="Times New Roman"/>
+          <w:b/>
+          <w:bCs w:val="0"/>
+          <w:i w:val="0"/>
+          <w:iCs w:val="0"/>
+          <w:color w:val="000000"/>
+          <w:sz w:val="28"/>
+          <w:szCs w:val="28"/>
+          <w:u w:val="none"/>
+          <w:vertAlign w:val="baseline"/>
+          <w:lang w:val="en-US"/>
+        </w:rPr>
+        <w:t>5.1 Thiết kế CSDL</w:t>
+      </w:r>
+    </w:p>
+    <w:p>
+      <w:pPr>
+        <w:outlineLvl w:val="1"/>
+        <w:rPr>
+          <w:rFonts w:hint="default" w:eastAsia="SimSun" w:cs="Times New Roman"/>
+          <w:b/>
+          <w:bCs w:val="0"/>
+          <w:i w:val="0"/>
+          <w:iCs w:val="0"/>
+          <w:color w:val="000000"/>
+          <w:sz w:val="28"/>
+          <w:szCs w:val="28"/>
+          <w:u w:val="none"/>
+          <w:vertAlign w:val="baseline"/>
+          <w:lang w:val="en-US"/>
+        </w:rPr>
+      </w:pPr>
+      <w:r>
+        <w:rPr>
+          <w:rFonts w:hint="default" w:eastAsia="SimSun" w:cs="Times New Roman"/>
+          <w:b/>
+          <w:bCs w:val="0"/>
+          <w:i w:val="0"/>
+          <w:iCs w:val="0"/>
+          <w:color w:val="000000"/>
+          <w:sz w:val="28"/>
+          <w:szCs w:val="28"/>
+          <w:u w:val="none"/>
+          <w:vertAlign w:val="baseline"/>
+          <w:lang w:val="en-US"/>
+        </w:rPr>
+        <w:t>- Thực thể Account</w:t>
+      </w:r>
+    </w:p>
+    <w:tbl>
+      <w:tblPr>
+        <w:tblStyle w:val="13"/>
+        <w:tblW w:w="9869" w:type="dxa"/>
+        <w:tblInd w:w="0" w:type="dxa"/>
+        <w:tblBorders>
+          <w:top w:val="single" w:color="auto" w:sz="4" w:space="0"/>
+          <w:left w:val="single" w:color="auto" w:sz="4" w:space="0"/>
+          <w:bottom w:val="single" w:color="auto" w:sz="4" w:space="0"/>
+          <w:right w:val="single" w:color="auto" w:sz="4" w:space="0"/>
+          <w:insideH w:val="single" w:color="auto" w:sz="4" w:space="0"/>
+          <w:insideV w:val="single" w:color="auto" w:sz="4" w:space="0"/>
+        </w:tblBorders>
+        <w:tblLayout w:type="autofit"/>
+        <w:tblCellMar>
+          <w:top w:w="0" w:type="dxa"/>
+          <w:left w:w="108" w:type="dxa"/>
+          <w:bottom w:w="0" w:type="dxa"/>
+          <w:right w:w="108" w:type="dxa"/>
+        </w:tblCellMar>
+      </w:tblPr>
+      <w:tblGrid>
+        <w:gridCol w:w="2564"/>
+        <w:gridCol w:w="2394"/>
+        <w:gridCol w:w="2122"/>
+        <w:gridCol w:w="2789"/>
+      </w:tblGrid>
+      <w:tr>
+        <w:tblPrEx>
+          <w:tblBorders>
+            <w:top w:val="single" w:color="auto" w:sz="4" w:space="0"/>
+            <w:left w:val="single" w:color="auto" w:sz="4" w:space="0"/>
+            <w:bottom w:val="single" w:color="auto" w:sz="4" w:space="0"/>
+            <w:right w:val="single" w:color="auto" w:sz="4" w:space="0"/>
+            <w:insideH w:val="single" w:color="auto" w:sz="4" w:space="0"/>
+            <w:insideV w:val="single" w:color="auto" w:sz="4" w:space="0"/>
+          </w:tblBorders>
+          <w:tblCellMar>
+            <w:top w:w="0" w:type="dxa"/>
+            <w:left w:w="108" w:type="dxa"/>
+            <w:bottom w:w="0" w:type="dxa"/>
+            <w:right w:w="108" w:type="dxa"/>
+          </w:tblCellMar>
+        </w:tblPrEx>
+        <w:tc>
+          <w:tcPr>
+            <w:tcW w:w="2564" w:type="dxa"/>
+            <w:vAlign w:val="center"/>
+          </w:tcPr>
+          <w:p>
+            <w:pPr>
+              <w:jc w:val="left"/>
+              <w:rPr>
+                <w:rFonts w:hint="default"/>
+                <w:lang w:val="en-US"/>
+              </w:rPr>
+            </w:pPr>
+            <w:r>
+              <w:rPr>
+                <w:lang w:val="en-US" w:eastAsia="zh-CN"/>
+              </w:rPr>
+              <w:t>THUỘC TÍNH</w:t>
+            </w:r>
+          </w:p>
+        </w:tc>
+        <w:tc>
+          <w:tcPr>
+            <w:tcW w:w="2394" w:type="dxa"/>
+            <w:vAlign w:val="center"/>
+          </w:tcPr>
+          <w:p>
+            <w:pPr>
+              <w:jc w:val="left"/>
+              <w:rPr>
+                <w:rFonts w:hint="default"/>
+                <w:lang w:val="en-US"/>
+              </w:rPr>
+            </w:pPr>
+            <w:r>
+              <w:rPr>
+                <w:lang w:val="en-US" w:eastAsia="zh-CN"/>
+              </w:rPr>
+              <w:t>KIỂU DỮ LIỆU</w:t>
+            </w:r>
+          </w:p>
+        </w:tc>
+        <w:tc>
+          <w:tcPr>
+            <w:tcW w:w="2122" w:type="dxa"/>
+            <w:vAlign w:val="center"/>
+          </w:tcPr>
+          <w:p>
+            <w:pPr>
+              <w:jc w:val="left"/>
+              <w:rPr>
+                <w:rFonts w:hint="default"/>
+                <w:lang w:val="en-US"/>
+              </w:rPr>
+            </w:pPr>
+            <w:r>
+              <w:rPr>
+                <w:lang w:val="en-US" w:eastAsia="zh-CN"/>
+              </w:rPr>
+              <w:t>MÔ TẢ</w:t>
+            </w:r>
+          </w:p>
+        </w:tc>
+        <w:tc>
+          <w:tcPr>
+            <w:tcW w:w="2789" w:type="dxa"/>
+            <w:vAlign w:val="center"/>
+          </w:tcPr>
+          <w:p>
+            <w:pPr>
+              <w:jc w:val="left"/>
+              <w:rPr>
+                <w:rFonts w:hint="default"/>
+                <w:lang w:val="en-US"/>
+              </w:rPr>
+            </w:pPr>
+            <w:r>
+              <w:rPr>
+                <w:lang w:val="en-US" w:eastAsia="zh-CN"/>
+              </w:rPr>
+              <w:t>RÀNG BUỘC</w:t>
+            </w:r>
+          </w:p>
+        </w:tc>
+      </w:tr>
+      <w:tr>
+        <w:tblPrEx>
+          <w:tblBorders>
+            <w:top w:val="single" w:color="auto" w:sz="4" w:space="0"/>
+            <w:left w:val="single" w:color="auto" w:sz="4" w:space="0"/>
+            <w:bottom w:val="single" w:color="auto" w:sz="4" w:space="0"/>
+            <w:right w:val="single" w:color="auto" w:sz="4" w:space="0"/>
+            <w:insideH w:val="single" w:color="auto" w:sz="4" w:space="0"/>
+            <w:insideV w:val="single" w:color="auto" w:sz="4" w:space="0"/>
+          </w:tblBorders>
+          <w:tblCellMar>
+            <w:top w:w="0" w:type="dxa"/>
+            <w:left w:w="108" w:type="dxa"/>
+            <w:bottom w:w="0" w:type="dxa"/>
+            <w:right w:w="108" w:type="dxa"/>
+          </w:tblCellMar>
+        </w:tblPrEx>
+        <w:tc>
+          <w:tcPr>
+            <w:tcW w:w="2564" w:type="dxa"/>
+            <w:vAlign w:val="center"/>
+          </w:tcPr>
+          <w:p>
+            <w:pPr>
+              <w:jc w:val="left"/>
+              <w:rPr>
+                <w:rFonts w:hint="default"/>
+                <w:lang w:val="en-US"/>
+              </w:rPr>
+            </w:pPr>
+            <w:r>
+              <w:rPr>
+                <w:lang w:val="en-US" w:eastAsia="zh-CN"/>
+              </w:rPr>
+              <w:t>id</w:t>
+            </w:r>
+          </w:p>
+        </w:tc>
+        <w:tc>
+          <w:tcPr>
+            <w:tcW w:w="2394" w:type="dxa"/>
+            <w:vAlign w:val="center"/>
+          </w:tcPr>
+          <w:p>
+            <w:pPr>
+              <w:jc w:val="left"/>
+              <w:rPr>
+                <w:rFonts w:hint="default"/>
+                <w:lang w:val="en-US"/>
+              </w:rPr>
+            </w:pPr>
+            <w:r>
+              <w:rPr>
+                <w:lang w:val="en-US" w:eastAsia="zh-CN"/>
+              </w:rPr>
+              <w:t>INT</w:t>
+            </w:r>
+          </w:p>
+        </w:tc>
+        <w:tc>
+          <w:tcPr>
+            <w:tcW w:w="2122" w:type="dxa"/>
+            <w:vAlign w:val="center"/>
+          </w:tcPr>
+          <w:p>
+            <w:pPr>
+              <w:jc w:val="left"/>
+              <w:rPr>
+                <w:rFonts w:hint="default"/>
+                <w:lang w:val="en-US"/>
+              </w:rPr>
+            </w:pPr>
+            <w:r>
+              <w:rPr>
+                <w:lang w:val="en-US" w:eastAsia="zh-CN"/>
+              </w:rPr>
+              <w:t>ID tài khoản</w:t>
+            </w:r>
+          </w:p>
+        </w:tc>
+        <w:tc>
+          <w:tcPr>
+            <w:tcW w:w="2789" w:type="dxa"/>
+            <w:vAlign w:val="center"/>
+          </w:tcPr>
+          <w:p>
+            <w:pPr>
+              <w:jc w:val="left"/>
+              <w:rPr>
+                <w:rFonts w:hint="default"/>
+                <w:lang w:val="en-US"/>
+              </w:rPr>
+            </w:pPr>
+            <w:r>
+              <w:rPr>
+                <w:lang w:val="en-US" w:eastAsia="zh-CN"/>
+              </w:rPr>
+              <w:t>PK, AUTO_INCREMENT</w:t>
+            </w:r>
+          </w:p>
+        </w:tc>
+      </w:tr>
+      <w:tr>
+        <w:tblPrEx>
+          <w:tblBorders>
+            <w:top w:val="single" w:color="auto" w:sz="4" w:space="0"/>
+            <w:left w:val="single" w:color="auto" w:sz="4" w:space="0"/>
+            <w:bottom w:val="single" w:color="auto" w:sz="4" w:space="0"/>
+            <w:right w:val="single" w:color="auto" w:sz="4" w:space="0"/>
+            <w:insideH w:val="single" w:color="auto" w:sz="4" w:space="0"/>
+            <w:insideV w:val="single" w:color="auto" w:sz="4" w:space="0"/>
+          </w:tblBorders>
+          <w:tblCellMar>
+            <w:top w:w="0" w:type="dxa"/>
+            <w:left w:w="108" w:type="dxa"/>
+            <w:bottom w:w="0" w:type="dxa"/>
+            <w:right w:w="108" w:type="dxa"/>
+          </w:tblCellMar>
+        </w:tblPrEx>
+        <w:tc>
+          <w:tcPr>
+            <w:tcW w:w="2564" w:type="dxa"/>
+            <w:vAlign w:val="center"/>
+          </w:tcPr>
+          <w:p>
+            <w:pPr>
+              <w:jc w:val="left"/>
+              <w:rPr>
+                <w:rFonts w:hint="default"/>
+                <w:lang w:val="en-US"/>
+              </w:rPr>
+            </w:pPr>
+            <w:r>
+              <w:rPr>
+                <w:lang w:val="en-US" w:eastAsia="zh-CN"/>
+              </w:rPr>
+              <w:t>email</w:t>
+            </w:r>
+          </w:p>
+        </w:tc>
+        <w:tc>
+          <w:tcPr>
+            <w:tcW w:w="2394" w:type="dxa"/>
+            <w:vAlign w:val="center"/>
+          </w:tcPr>
+          <w:p>
+            <w:pPr>
+              <w:jc w:val="left"/>
+              <w:rPr>
+                <w:rFonts w:hint="default"/>
+                <w:lang w:val="en-US"/>
+              </w:rPr>
+            </w:pPr>
+            <w:r>
+              <w:rPr>
+                <w:lang w:val="en-US" w:eastAsia="zh-CN"/>
+              </w:rPr>
+              <w:t>VARCHAR(100)</w:t>
+            </w:r>
+          </w:p>
+        </w:tc>
+        <w:tc>
+          <w:tcPr>
+            <w:tcW w:w="2122" w:type="dxa"/>
+            <w:vAlign w:val="center"/>
+          </w:tcPr>
+          <w:p>
+            <w:pPr>
+              <w:jc w:val="left"/>
+              <w:rPr>
+                <w:rFonts w:hint="default"/>
+                <w:lang w:val="en-US"/>
+              </w:rPr>
+            </w:pPr>
+            <w:r>
+              <w:rPr>
+                <w:lang w:val="en-US" w:eastAsia="zh-CN"/>
+              </w:rPr>
+              <w:t>Email người dùng</w:t>
+            </w:r>
+          </w:p>
+        </w:tc>
+        <w:tc>
+          <w:tcPr>
+            <w:tcW w:w="2789" w:type="dxa"/>
+            <w:vAlign w:val="center"/>
+          </w:tcPr>
+          <w:p>
+            <w:pPr>
+              <w:jc w:val="left"/>
+              <w:rPr>
+                <w:rFonts w:hint="default"/>
+                <w:lang w:val="en-US"/>
+              </w:rPr>
+            </w:pPr>
+            <w:r>
+              <w:rPr>
+                <w:lang w:val="en-US" w:eastAsia="zh-CN"/>
+              </w:rPr>
+              <w:t>NOT NULL, UNIQUE</w:t>
+            </w:r>
+          </w:p>
+        </w:tc>
+      </w:tr>
+      <w:tr>
+        <w:tblPrEx>
+          <w:tblBorders>
+            <w:top w:val="single" w:color="auto" w:sz="4" w:space="0"/>
+            <w:left w:val="single" w:color="auto" w:sz="4" w:space="0"/>
+            <w:bottom w:val="single" w:color="auto" w:sz="4" w:space="0"/>
+            <w:right w:val="single" w:color="auto" w:sz="4" w:space="0"/>
+            <w:insideH w:val="single" w:color="auto" w:sz="4" w:space="0"/>
+            <w:insideV w:val="single" w:color="auto" w:sz="4" w:space="0"/>
+          </w:tblBorders>
+          <w:tblCellMar>
+            <w:top w:w="0" w:type="dxa"/>
+            <w:left w:w="108" w:type="dxa"/>
+            <w:bottom w:w="0" w:type="dxa"/>
+            <w:right w:w="108" w:type="dxa"/>
+          </w:tblCellMar>
+        </w:tblPrEx>
+        <w:tc>
+          <w:tcPr>
+            <w:tcW w:w="2564" w:type="dxa"/>
+            <w:vAlign w:val="center"/>
+          </w:tcPr>
+          <w:p>
+            <w:pPr>
+              <w:jc w:val="left"/>
+              <w:rPr>
+                <w:rFonts w:hint="default"/>
+                <w:lang w:val="en-US"/>
+              </w:rPr>
+            </w:pPr>
+            <w:r>
+              <w:rPr>
+                <w:lang w:val="en-US" w:eastAsia="zh-CN"/>
+              </w:rPr>
+              <w:t>password</w:t>
+            </w:r>
+          </w:p>
+        </w:tc>
+        <w:tc>
+          <w:tcPr>
+            <w:tcW w:w="2394" w:type="dxa"/>
+            <w:vAlign w:val="center"/>
+          </w:tcPr>
+          <w:p>
+            <w:pPr>
+              <w:jc w:val="left"/>
+              <w:rPr>
+                <w:rFonts w:hint="default"/>
+                <w:lang w:val="en-US"/>
+              </w:rPr>
+            </w:pPr>
+            <w:r>
+              <w:rPr>
+                <w:lang w:val="en-US" w:eastAsia="zh-CN"/>
+              </w:rPr>
+              <w:t>VARCHAR(100)</w:t>
+            </w:r>
+          </w:p>
+        </w:tc>
+        <w:tc>
+          <w:tcPr>
+            <w:tcW w:w="2122" w:type="dxa"/>
+            <w:vAlign w:val="center"/>
+          </w:tcPr>
+          <w:p>
+            <w:pPr>
+              <w:jc w:val="left"/>
+              <w:rPr>
+                <w:rFonts w:hint="default"/>
+                <w:lang w:val="en-US"/>
+              </w:rPr>
+            </w:pPr>
+            <w:r>
+              <w:rPr>
+                <w:lang w:val="en-US" w:eastAsia="zh-CN"/>
+              </w:rPr>
+              <w:t>Mật khẩu đã mã hóa</w:t>
+            </w:r>
+          </w:p>
+        </w:tc>
+        <w:tc>
+          <w:tcPr>
+            <w:tcW w:w="2789" w:type="dxa"/>
+            <w:vAlign w:val="center"/>
+          </w:tcPr>
+          <w:p>
+            <w:pPr>
+              <w:jc w:val="left"/>
+              <w:rPr>
+                <w:rFonts w:hint="default"/>
+                <w:lang w:val="en-US"/>
+              </w:rPr>
+            </w:pPr>
+            <w:r>
+              <w:rPr>
+                <w:lang w:val="en-US" w:eastAsia="zh-CN"/>
+              </w:rPr>
+              <w:t>NOT NULL</w:t>
+            </w:r>
+          </w:p>
+        </w:tc>
+      </w:tr>
+      <w:tr>
+        <w:tblPrEx>
+          <w:tblBorders>
+            <w:top w:val="single" w:color="auto" w:sz="4" w:space="0"/>
+            <w:left w:val="single" w:color="auto" w:sz="4" w:space="0"/>
+            <w:bottom w:val="single" w:color="auto" w:sz="4" w:space="0"/>
+            <w:right w:val="single" w:color="auto" w:sz="4" w:space="0"/>
+            <w:insideH w:val="single" w:color="auto" w:sz="4" w:space="0"/>
+            <w:insideV w:val="single" w:color="auto" w:sz="4" w:space="0"/>
+          </w:tblBorders>
+          <w:tblCellMar>
+            <w:top w:w="0" w:type="dxa"/>
+            <w:left w:w="108" w:type="dxa"/>
+            <w:bottom w:w="0" w:type="dxa"/>
+            <w:right w:w="108" w:type="dxa"/>
+          </w:tblCellMar>
+        </w:tblPrEx>
+        <w:tc>
+          <w:tcPr>
+            <w:tcW w:w="2564" w:type="dxa"/>
+            <w:vAlign w:val="center"/>
+          </w:tcPr>
+          <w:p>
+            <w:pPr>
+              <w:jc w:val="left"/>
+              <w:rPr>
+                <w:rFonts w:hint="default"/>
+                <w:lang w:val="en-US"/>
+              </w:rPr>
+            </w:pPr>
+            <w:r>
+              <w:rPr>
+                <w:lang w:val="en-US" w:eastAsia="zh-CN"/>
+              </w:rPr>
+              <w:t>gender</w:t>
+            </w:r>
+          </w:p>
+        </w:tc>
+        <w:tc>
+          <w:tcPr>
+            <w:tcW w:w="2394" w:type="dxa"/>
+            <w:vAlign w:val="center"/>
+          </w:tcPr>
+          <w:p>
+            <w:pPr>
+              <w:jc w:val="left"/>
+              <w:rPr>
+                <w:rFonts w:hint="default"/>
+                <w:lang w:val="en-US"/>
+              </w:rPr>
+            </w:pPr>
+            <w:r>
+              <w:rPr>
+                <w:lang w:val="en-US" w:eastAsia="zh-CN"/>
+              </w:rPr>
+              <w:t>BIT</w:t>
+            </w:r>
+          </w:p>
+        </w:tc>
+        <w:tc>
+          <w:tcPr>
+            <w:tcW w:w="2122" w:type="dxa"/>
+            <w:vAlign w:val="center"/>
+          </w:tcPr>
+          <w:p>
+            <w:pPr>
+              <w:jc w:val="left"/>
+              <w:rPr>
+                <w:rFonts w:hint="default"/>
+                <w:lang w:val="en-US"/>
+              </w:rPr>
+            </w:pPr>
+            <w:r>
+              <w:rPr>
+                <w:lang w:val="en-US" w:eastAsia="zh-CN"/>
+              </w:rPr>
+              <w:t>Giới tính</w:t>
+            </w:r>
+          </w:p>
+        </w:tc>
+        <w:tc>
+          <w:tcPr>
+            <w:tcW w:w="2789" w:type="dxa"/>
+            <w:vAlign w:val="center"/>
+          </w:tcPr>
+          <w:p>
+            <w:pPr>
+              <w:jc w:val="left"/>
+              <w:rPr>
+                <w:rFonts w:hint="default"/>
+                <w:lang w:val="en-US"/>
+              </w:rPr>
+            </w:pPr>
+            <w:r>
+              <w:rPr>
+                <w:lang w:val="en-US" w:eastAsia="zh-CN"/>
+              </w:rPr>
+              <w:t>DEFAULT 0</w:t>
+            </w:r>
+          </w:p>
+        </w:tc>
+      </w:tr>
+      <w:tr>
+        <w:tblPrEx>
+          <w:tblBorders>
+            <w:top w:val="single" w:color="auto" w:sz="4" w:space="0"/>
+            <w:left w:val="single" w:color="auto" w:sz="4" w:space="0"/>
+            <w:bottom w:val="single" w:color="auto" w:sz="4" w:space="0"/>
+            <w:right w:val="single" w:color="auto" w:sz="4" w:space="0"/>
+            <w:insideH w:val="single" w:color="auto" w:sz="4" w:space="0"/>
+            <w:insideV w:val="single" w:color="auto" w:sz="4" w:space="0"/>
+          </w:tblBorders>
+          <w:tblCellMar>
+            <w:top w:w="0" w:type="dxa"/>
+            <w:left w:w="108" w:type="dxa"/>
+            <w:bottom w:w="0" w:type="dxa"/>
+            <w:right w:w="108" w:type="dxa"/>
+          </w:tblCellMar>
+        </w:tblPrEx>
+        <w:tc>
+          <w:tcPr>
+            <w:tcW w:w="2564" w:type="dxa"/>
+            <w:vAlign w:val="center"/>
+          </w:tcPr>
+          <w:p>
+            <w:pPr>
+              <w:jc w:val="left"/>
+              <w:rPr>
+                <w:rFonts w:hint="default"/>
+                <w:lang w:val="en-US"/>
+              </w:rPr>
+            </w:pPr>
+            <w:r>
+              <w:rPr>
+                <w:lang w:val="en-US" w:eastAsia="zh-CN"/>
+              </w:rPr>
+              <w:t>birthday</w:t>
+            </w:r>
+          </w:p>
+        </w:tc>
+        <w:tc>
+          <w:tcPr>
+            <w:tcW w:w="2394" w:type="dxa"/>
+            <w:vAlign w:val="center"/>
+          </w:tcPr>
+          <w:p>
+            <w:pPr>
+              <w:jc w:val="left"/>
+              <w:rPr>
+                <w:rFonts w:hint="default"/>
+                <w:lang w:val="en-US"/>
+              </w:rPr>
+            </w:pPr>
+            <w:r>
+              <w:rPr>
+                <w:lang w:val="en-US" w:eastAsia="zh-CN"/>
+              </w:rPr>
+              <w:t>DATE</w:t>
+            </w:r>
+          </w:p>
+        </w:tc>
+        <w:tc>
+          <w:tcPr>
+            <w:tcW w:w="2122" w:type="dxa"/>
+            <w:vAlign w:val="center"/>
+          </w:tcPr>
+          <w:p>
+            <w:pPr>
+              <w:jc w:val="left"/>
+              <w:rPr>
+                <w:rFonts w:hint="default"/>
+                <w:lang w:val="en-US"/>
+              </w:rPr>
+            </w:pPr>
+            <w:r>
+              <w:rPr>
+                <w:lang w:val="en-US" w:eastAsia="zh-CN"/>
+              </w:rPr>
+              <w:t>Ngày sinh</w:t>
+            </w:r>
+          </w:p>
+        </w:tc>
+        <w:tc>
+          <w:tcPr>
+            <w:tcW w:w="2789" w:type="dxa"/>
+            <w:vAlign w:val="center"/>
+          </w:tcPr>
+          <w:p>
+            <w:pPr>
+              <w:jc w:val="left"/>
+              <w:rPr>
+                <w:rFonts w:hint="default"/>
+                <w:lang w:val="en-US"/>
+              </w:rPr>
+            </w:pPr>
+            <w:r>
+              <w:rPr>
+                <w:lang w:val="en-US" w:eastAsia="zh-CN"/>
+              </w:rPr>
+              <w:t>NULL</w:t>
+            </w:r>
+          </w:p>
+        </w:tc>
+      </w:tr>
+      <w:tr>
+        <w:tblPrEx>
+          <w:tblBorders>
+            <w:top w:val="single" w:color="auto" w:sz="4" w:space="0"/>
+            <w:left w:val="single" w:color="auto" w:sz="4" w:space="0"/>
+            <w:bottom w:val="single" w:color="auto" w:sz="4" w:space="0"/>
+            <w:right w:val="single" w:color="auto" w:sz="4" w:space="0"/>
+            <w:insideH w:val="single" w:color="auto" w:sz="4" w:space="0"/>
+            <w:insideV w:val="single" w:color="auto" w:sz="4" w:space="0"/>
+          </w:tblBorders>
+          <w:tblCellMar>
+            <w:top w:w="0" w:type="dxa"/>
+            <w:left w:w="108" w:type="dxa"/>
+            <w:bottom w:w="0" w:type="dxa"/>
+            <w:right w:w="108" w:type="dxa"/>
+          </w:tblCellMar>
+        </w:tblPrEx>
+        <w:tc>
+          <w:tcPr>
+            <w:tcW w:w="2564" w:type="dxa"/>
+            <w:vAlign w:val="center"/>
+          </w:tcPr>
+          <w:p>
+            <w:pPr>
+              <w:jc w:val="left"/>
+              <w:rPr>
+                <w:rFonts w:hint="default"/>
+                <w:lang w:val="en-US"/>
+              </w:rPr>
+            </w:pPr>
+            <w:r>
+              <w:rPr>
+                <w:lang w:val="en-US" w:eastAsia="zh-CN"/>
+              </w:rPr>
+              <w:t>fullname</w:t>
+            </w:r>
+          </w:p>
+        </w:tc>
+        <w:tc>
+          <w:tcPr>
+            <w:tcW w:w="2394" w:type="dxa"/>
+            <w:vAlign w:val="center"/>
+          </w:tcPr>
+          <w:p>
+            <w:pPr>
+              <w:jc w:val="left"/>
+              <w:rPr>
+                <w:rFonts w:hint="default"/>
+                <w:lang w:val="en-US"/>
+              </w:rPr>
+            </w:pPr>
+            <w:r>
+              <w:rPr>
+                <w:lang w:val="en-US" w:eastAsia="zh-CN"/>
+              </w:rPr>
+              <w:t>NVARCHAR(100)</w:t>
+            </w:r>
+          </w:p>
+        </w:tc>
+        <w:tc>
+          <w:tcPr>
+            <w:tcW w:w="2122" w:type="dxa"/>
+            <w:vAlign w:val="center"/>
+          </w:tcPr>
+          <w:p>
+            <w:pPr>
+              <w:jc w:val="left"/>
+              <w:rPr>
+                <w:rFonts w:hint="default"/>
+                <w:lang w:val="en-US"/>
+              </w:rPr>
+            </w:pPr>
+            <w:r>
+              <w:rPr>
+                <w:lang w:val="en-US" w:eastAsia="zh-CN"/>
+              </w:rPr>
+              <w:t>Họ và tên</w:t>
+            </w:r>
+          </w:p>
+        </w:tc>
+        <w:tc>
+          <w:tcPr>
+            <w:tcW w:w="2789" w:type="dxa"/>
+            <w:vAlign w:val="center"/>
+          </w:tcPr>
+          <w:p>
+            <w:pPr>
+              <w:jc w:val="left"/>
+              <w:rPr>
+                <w:rFonts w:hint="default"/>
+                <w:lang w:val="en-US"/>
+              </w:rPr>
+            </w:pPr>
+            <w:r>
+              <w:rPr>
+                <w:lang w:val="en-US" w:eastAsia="zh-CN"/>
+              </w:rPr>
+              <w:t>NOT NULL</w:t>
+            </w:r>
+          </w:p>
+        </w:tc>
+      </w:tr>
+      <w:tr>
+        <w:tblPrEx>
+          <w:tblBorders>
+            <w:top w:val="single" w:color="auto" w:sz="4" w:space="0"/>
+            <w:left w:val="single" w:color="auto" w:sz="4" w:space="0"/>
+            <w:bottom w:val="single" w:color="auto" w:sz="4" w:space="0"/>
+            <w:right w:val="single" w:color="auto" w:sz="4" w:space="0"/>
+            <w:insideH w:val="single" w:color="auto" w:sz="4" w:space="0"/>
+            <w:insideV w:val="single" w:color="auto" w:sz="4" w:space="0"/>
+          </w:tblBorders>
+          <w:tblCellMar>
+            <w:top w:w="0" w:type="dxa"/>
+            <w:left w:w="108" w:type="dxa"/>
+            <w:bottom w:w="0" w:type="dxa"/>
+            <w:right w:w="108" w:type="dxa"/>
+          </w:tblCellMar>
+        </w:tblPrEx>
+        <w:tc>
+          <w:tcPr>
+            <w:tcW w:w="2564" w:type="dxa"/>
+            <w:vAlign w:val="center"/>
+          </w:tcPr>
+          <w:p>
+            <w:pPr>
+              <w:jc w:val="left"/>
+              <w:rPr>
+                <w:rFonts w:hint="default"/>
+                <w:lang w:val="en-US"/>
+              </w:rPr>
+            </w:pPr>
+            <w:r>
+              <w:rPr>
+                <w:lang w:val="en-US" w:eastAsia="zh-CN"/>
+              </w:rPr>
+              <w:t>avatar_url</w:t>
+            </w:r>
+          </w:p>
+        </w:tc>
+        <w:tc>
+          <w:tcPr>
+            <w:tcW w:w="2394" w:type="dxa"/>
+            <w:vAlign w:val="center"/>
+          </w:tcPr>
+          <w:p>
+            <w:pPr>
+              <w:jc w:val="left"/>
+              <w:rPr>
+                <w:rFonts w:hint="default"/>
+                <w:lang w:val="en-US"/>
+              </w:rPr>
+            </w:pPr>
+            <w:r>
+              <w:rPr>
+                <w:lang w:val="en-US" w:eastAsia="zh-CN"/>
+              </w:rPr>
+              <w:t>VARCHAR(255)</w:t>
+            </w:r>
+          </w:p>
+        </w:tc>
+        <w:tc>
+          <w:tcPr>
+            <w:tcW w:w="2122" w:type="dxa"/>
+            <w:vAlign w:val="center"/>
+          </w:tcPr>
+          <w:p>
+            <w:pPr>
+              <w:jc w:val="left"/>
+              <w:rPr>
+                <w:rFonts w:hint="default"/>
+                <w:lang w:val="en-US"/>
+              </w:rPr>
+            </w:pPr>
+            <w:r>
+              <w:rPr>
+                <w:lang w:val="en-US" w:eastAsia="zh-CN"/>
+              </w:rPr>
+              <w:t>Ảnh đại diện</w:t>
+            </w:r>
+          </w:p>
+        </w:tc>
+        <w:tc>
+          <w:tcPr>
+            <w:tcW w:w="2789" w:type="dxa"/>
+            <w:vAlign w:val="center"/>
+          </w:tcPr>
+          <w:p>
+            <w:pPr>
+              <w:jc w:val="left"/>
+              <w:rPr>
+                <w:rFonts w:hint="default"/>
+                <w:lang w:val="en-US"/>
+              </w:rPr>
+            </w:pPr>
+            <w:r>
+              <w:rPr>
+                <w:lang w:val="en-US" w:eastAsia="zh-CN"/>
+              </w:rPr>
+              <w:t>NULL</w:t>
+            </w:r>
+          </w:p>
+        </w:tc>
+      </w:tr>
+      <w:tr>
+        <w:tblPrEx>
+          <w:tblBorders>
+            <w:top w:val="single" w:color="auto" w:sz="4" w:space="0"/>
+            <w:left w:val="single" w:color="auto" w:sz="4" w:space="0"/>
+            <w:bottom w:val="single" w:color="auto" w:sz="4" w:space="0"/>
+            <w:right w:val="single" w:color="auto" w:sz="4" w:space="0"/>
+            <w:insideH w:val="single" w:color="auto" w:sz="4" w:space="0"/>
+            <w:insideV w:val="single" w:color="auto" w:sz="4" w:space="0"/>
+          </w:tblBorders>
+          <w:tblCellMar>
+            <w:top w:w="0" w:type="dxa"/>
+            <w:left w:w="108" w:type="dxa"/>
+            <w:bottom w:w="0" w:type="dxa"/>
+            <w:right w:w="108" w:type="dxa"/>
+          </w:tblCellMar>
+        </w:tblPrEx>
+        <w:tc>
+          <w:tcPr>
+            <w:tcW w:w="2564" w:type="dxa"/>
+            <w:vAlign w:val="center"/>
+          </w:tcPr>
+          <w:p>
+            <w:pPr>
+              <w:jc w:val="left"/>
+              <w:rPr>
+                <w:rFonts w:hint="default"/>
+                <w:lang w:val="en-US"/>
+              </w:rPr>
+            </w:pPr>
+            <w:r>
+              <w:rPr>
+                <w:lang w:val="en-US" w:eastAsia="zh-CN"/>
+              </w:rPr>
+              <w:t>phone</w:t>
+            </w:r>
+          </w:p>
+        </w:tc>
+        <w:tc>
+          <w:tcPr>
+            <w:tcW w:w="2394" w:type="dxa"/>
+            <w:vAlign w:val="center"/>
+          </w:tcPr>
+          <w:p>
+            <w:pPr>
+              <w:jc w:val="left"/>
+              <w:rPr>
+                <w:rFonts w:hint="default"/>
+                <w:lang w:val="en-US"/>
+              </w:rPr>
+            </w:pPr>
+            <w:r>
+              <w:rPr>
+                <w:lang w:val="en-US" w:eastAsia="zh-CN"/>
+              </w:rPr>
+              <w:t>VARCHAR(15)</w:t>
+            </w:r>
+          </w:p>
+        </w:tc>
+        <w:tc>
+          <w:tcPr>
+            <w:tcW w:w="2122" w:type="dxa"/>
+            <w:vAlign w:val="center"/>
+          </w:tcPr>
+          <w:p>
+            <w:pPr>
+              <w:jc w:val="left"/>
+              <w:rPr>
+                <w:rFonts w:hint="default"/>
+                <w:lang w:val="en-US"/>
+              </w:rPr>
+            </w:pPr>
+            <w:r>
+              <w:rPr>
+                <w:lang w:val="en-US" w:eastAsia="zh-CN"/>
+              </w:rPr>
+              <w:t>Số điện thoại</w:t>
+            </w:r>
+          </w:p>
+        </w:tc>
+        <w:tc>
+          <w:tcPr>
+            <w:tcW w:w="2789" w:type="dxa"/>
+            <w:vAlign w:val="center"/>
+          </w:tcPr>
+          <w:p>
+            <w:pPr>
+              <w:jc w:val="left"/>
+              <w:rPr>
+                <w:rFonts w:hint="default"/>
+                <w:lang w:val="en-US"/>
+              </w:rPr>
+            </w:pPr>
+            <w:r>
+              <w:rPr>
+                <w:lang w:val="en-US" w:eastAsia="zh-CN"/>
+              </w:rPr>
+              <w:t>NULL</w:t>
+            </w:r>
+          </w:p>
+        </w:tc>
+      </w:tr>
+      <w:tr>
+        <w:tblPrEx>
+          <w:tblBorders>
+            <w:top w:val="single" w:color="auto" w:sz="4" w:space="0"/>
+            <w:left w:val="single" w:color="auto" w:sz="4" w:space="0"/>
+            <w:bottom w:val="single" w:color="auto" w:sz="4" w:space="0"/>
+            <w:right w:val="single" w:color="auto" w:sz="4" w:space="0"/>
+            <w:insideH w:val="single" w:color="auto" w:sz="4" w:space="0"/>
+            <w:insideV w:val="single" w:color="auto" w:sz="4" w:space="0"/>
+          </w:tblBorders>
+          <w:tblCellMar>
+            <w:top w:w="0" w:type="dxa"/>
+            <w:left w:w="108" w:type="dxa"/>
+            <w:bottom w:w="0" w:type="dxa"/>
+            <w:right w:w="108" w:type="dxa"/>
+          </w:tblCellMar>
+        </w:tblPrEx>
+        <w:tc>
+          <w:tcPr>
+            <w:tcW w:w="2564" w:type="dxa"/>
+            <w:vAlign w:val="center"/>
+          </w:tcPr>
+          <w:p>
+            <w:pPr>
+              <w:jc w:val="left"/>
+              <w:rPr>
+                <w:rFonts w:hint="default"/>
+                <w:lang w:val="en-US"/>
+              </w:rPr>
+            </w:pPr>
+            <w:r>
+              <w:rPr>
+                <w:lang w:val="en-US" w:eastAsia="zh-CN"/>
+              </w:rPr>
+              <w:t>average_order_value</w:t>
+            </w:r>
+          </w:p>
+        </w:tc>
+        <w:tc>
+          <w:tcPr>
+            <w:tcW w:w="2394" w:type="dxa"/>
+            <w:vAlign w:val="center"/>
+          </w:tcPr>
+          <w:p>
+            <w:pPr>
+              <w:jc w:val="left"/>
+              <w:rPr>
+                <w:rFonts w:hint="default"/>
+                <w:lang w:val="en-US"/>
+              </w:rPr>
+            </w:pPr>
+            <w:r>
+              <w:rPr>
+                <w:lang w:val="en-US" w:eastAsia="zh-CN"/>
+              </w:rPr>
+              <w:t>DECIMAL(18,2)</w:t>
+            </w:r>
+          </w:p>
+        </w:tc>
+        <w:tc>
+          <w:tcPr>
+            <w:tcW w:w="2122" w:type="dxa"/>
+            <w:vAlign w:val="center"/>
+          </w:tcPr>
+          <w:p>
+            <w:pPr>
+              <w:jc w:val="left"/>
+              <w:rPr>
+                <w:rFonts w:hint="default"/>
+                <w:lang w:val="en-US"/>
+              </w:rPr>
+            </w:pPr>
+            <w:r>
+              <w:rPr>
+                <w:lang w:val="en-US" w:eastAsia="zh-CN"/>
+              </w:rPr>
+              <w:t>Giá trị đơn trung bình</w:t>
+            </w:r>
+          </w:p>
+        </w:tc>
+        <w:tc>
+          <w:tcPr>
+            <w:tcW w:w="2789" w:type="dxa"/>
+            <w:vAlign w:val="center"/>
+          </w:tcPr>
+          <w:p>
+            <w:pPr>
+              <w:jc w:val="left"/>
+              <w:rPr>
+                <w:rFonts w:hint="default"/>
+                <w:lang w:val="en-US"/>
+              </w:rPr>
+            </w:pPr>
+            <w:r>
+              <w:rPr>
+                <w:lang w:val="en-US" w:eastAsia="zh-CN"/>
+              </w:rPr>
+              <w:t>DEFAULT 0</w:t>
+            </w:r>
+          </w:p>
+        </w:tc>
+      </w:tr>
+      <w:tr>
+        <w:tblPrEx>
+          <w:tblBorders>
+            <w:top w:val="single" w:color="auto" w:sz="4" w:space="0"/>
+            <w:left w:val="single" w:color="auto" w:sz="4" w:space="0"/>
+            <w:bottom w:val="single" w:color="auto" w:sz="4" w:space="0"/>
+            <w:right w:val="single" w:color="auto" w:sz="4" w:space="0"/>
+            <w:insideH w:val="single" w:color="auto" w:sz="4" w:space="0"/>
+            <w:insideV w:val="single" w:color="auto" w:sz="4" w:space="0"/>
+          </w:tblBorders>
+          <w:tblCellMar>
+            <w:top w:w="0" w:type="dxa"/>
+            <w:left w:w="108" w:type="dxa"/>
+            <w:bottom w:w="0" w:type="dxa"/>
+            <w:right w:w="108" w:type="dxa"/>
+          </w:tblCellMar>
+        </w:tblPrEx>
+        <w:tc>
+          <w:tcPr>
+            <w:tcW w:w="2564" w:type="dxa"/>
+            <w:vAlign w:val="center"/>
+          </w:tcPr>
+          <w:p>
+            <w:pPr>
+              <w:jc w:val="left"/>
+              <w:rPr>
+                <w:rFonts w:hint="default"/>
+                <w:lang w:val="en-US"/>
+              </w:rPr>
+            </w:pPr>
+            <w:r>
+              <w:rPr>
+                <w:lang w:val="en-US" w:eastAsia="zh-CN"/>
+              </w:rPr>
+              <w:t>user_rank</w:t>
+            </w:r>
+          </w:p>
+        </w:tc>
+        <w:tc>
+          <w:tcPr>
+            <w:tcW w:w="2394" w:type="dxa"/>
+            <w:vAlign w:val="center"/>
+          </w:tcPr>
+          <w:p>
+            <w:pPr>
+              <w:jc w:val="left"/>
+              <w:rPr>
+                <w:rFonts w:hint="default"/>
+                <w:lang w:val="en-US"/>
+              </w:rPr>
+            </w:pPr>
+            <w:r>
+              <w:rPr>
+                <w:lang w:val="en-US" w:eastAsia="zh-CN"/>
+              </w:rPr>
+              <w:t>NVARCHAR(20)</w:t>
+            </w:r>
+          </w:p>
+        </w:tc>
+        <w:tc>
+          <w:tcPr>
+            <w:tcW w:w="2122" w:type="dxa"/>
+            <w:vAlign w:val="center"/>
+          </w:tcPr>
+          <w:p>
+            <w:pPr>
+              <w:jc w:val="left"/>
+              <w:rPr>
+                <w:rFonts w:hint="default"/>
+                <w:lang w:val="en-US"/>
+              </w:rPr>
+            </w:pPr>
+            <w:r>
+              <w:rPr>
+                <w:lang w:val="en-US" w:eastAsia="zh-CN"/>
+              </w:rPr>
+              <w:t>Hạng người dùng</w:t>
+            </w:r>
+          </w:p>
+        </w:tc>
+        <w:tc>
+          <w:tcPr>
+            <w:tcW w:w="2789" w:type="dxa"/>
+            <w:vAlign w:val="center"/>
+          </w:tcPr>
+          <w:p>
+            <w:pPr>
+              <w:jc w:val="left"/>
+              <w:rPr>
+                <w:rFonts w:hint="default"/>
+                <w:lang w:val="en-US"/>
+              </w:rPr>
+            </w:pPr>
+            <w:r>
+              <w:rPr>
+                <w:lang w:val="en-US" w:eastAsia="zh-CN"/>
+              </w:rPr>
+              <w:t>DEFAULT N'Đồng'</w:t>
+            </w:r>
+          </w:p>
+        </w:tc>
+      </w:tr>
+      <w:tr>
+        <w:tblPrEx>
+          <w:tblBorders>
+            <w:top w:val="single" w:color="auto" w:sz="4" w:space="0"/>
+            <w:left w:val="single" w:color="auto" w:sz="4" w:space="0"/>
+            <w:bottom w:val="single" w:color="auto" w:sz="4" w:space="0"/>
+            <w:right w:val="single" w:color="auto" w:sz="4" w:space="0"/>
+            <w:insideH w:val="single" w:color="auto" w:sz="4" w:space="0"/>
+            <w:insideV w:val="single" w:color="auto" w:sz="4" w:space="0"/>
+          </w:tblBorders>
+          <w:tblCellMar>
+            <w:top w:w="0" w:type="dxa"/>
+            <w:left w:w="108" w:type="dxa"/>
+            <w:bottom w:w="0" w:type="dxa"/>
+            <w:right w:w="108" w:type="dxa"/>
+          </w:tblCellMar>
+        </w:tblPrEx>
+        <w:tc>
+          <w:tcPr>
+            <w:tcW w:w="2564" w:type="dxa"/>
+            <w:vAlign w:val="center"/>
+          </w:tcPr>
+          <w:p>
+            <w:pPr>
+              <w:jc w:val="left"/>
+              <w:rPr>
+                <w:rFonts w:hint="default"/>
+                <w:lang w:val="en-US"/>
+              </w:rPr>
+            </w:pPr>
+            <w:r>
+              <w:rPr>
+                <w:lang w:val="en-US" w:eastAsia="zh-CN"/>
+              </w:rPr>
+              <w:t>total_spent</w:t>
+            </w:r>
+          </w:p>
+        </w:tc>
+        <w:tc>
+          <w:tcPr>
+            <w:tcW w:w="2394" w:type="dxa"/>
+            <w:vAlign w:val="center"/>
+          </w:tcPr>
+          <w:p>
+            <w:pPr>
+              <w:jc w:val="left"/>
+              <w:rPr>
+                <w:rFonts w:hint="default"/>
+                <w:lang w:val="en-US"/>
+              </w:rPr>
+            </w:pPr>
+            <w:r>
+              <w:rPr>
+                <w:lang w:val="en-US" w:eastAsia="zh-CN"/>
+              </w:rPr>
+              <w:t>DECIMAL(18,2)</w:t>
+            </w:r>
+          </w:p>
+        </w:tc>
+        <w:tc>
+          <w:tcPr>
+            <w:tcW w:w="2122" w:type="dxa"/>
+            <w:vAlign w:val="center"/>
+          </w:tcPr>
+          <w:p>
+            <w:pPr>
+              <w:jc w:val="left"/>
+              <w:rPr>
+                <w:rFonts w:hint="default"/>
+                <w:lang w:val="en-US"/>
+              </w:rPr>
+            </w:pPr>
+            <w:r>
+              <w:rPr>
+                <w:lang w:val="en-US" w:eastAsia="zh-CN"/>
+              </w:rPr>
+              <w:t>Tổng chi tiêu</w:t>
+            </w:r>
+          </w:p>
+        </w:tc>
+        <w:tc>
+          <w:tcPr>
+            <w:tcW w:w="2789" w:type="dxa"/>
+            <w:vAlign w:val="center"/>
+          </w:tcPr>
+          <w:p>
+            <w:pPr>
+              <w:jc w:val="left"/>
+              <w:rPr>
+                <w:rFonts w:hint="default"/>
+                <w:lang w:val="en-US"/>
+              </w:rPr>
+            </w:pPr>
+            <w:r>
+              <w:rPr>
+                <w:lang w:val="en-US" w:eastAsia="zh-CN"/>
+              </w:rPr>
+              <w:t>DEFAULT 0</w:t>
+            </w:r>
+          </w:p>
+        </w:tc>
+      </w:tr>
+      <w:tr>
+        <w:tblPrEx>
+          <w:tblBorders>
+            <w:top w:val="single" w:color="auto" w:sz="4" w:space="0"/>
+            <w:left w:val="single" w:color="auto" w:sz="4" w:space="0"/>
+            <w:bottom w:val="single" w:color="auto" w:sz="4" w:space="0"/>
+            <w:right w:val="single" w:color="auto" w:sz="4" w:space="0"/>
+            <w:insideH w:val="single" w:color="auto" w:sz="4" w:space="0"/>
+            <w:insideV w:val="single" w:color="auto" w:sz="4" w:space="0"/>
+          </w:tblBorders>
+          <w:tblCellMar>
+            <w:top w:w="0" w:type="dxa"/>
+            <w:left w:w="108" w:type="dxa"/>
+            <w:bottom w:w="0" w:type="dxa"/>
+            <w:right w:w="108" w:type="dxa"/>
+          </w:tblCellMar>
+        </w:tblPrEx>
+        <w:tc>
+          <w:tcPr>
+            <w:tcW w:w="2564" w:type="dxa"/>
+            <w:vAlign w:val="center"/>
+          </w:tcPr>
+          <w:p>
+            <w:pPr>
+              <w:jc w:val="left"/>
+              <w:rPr>
+                <w:rFonts w:hint="default"/>
+                <w:lang w:val="en-US"/>
+              </w:rPr>
+            </w:pPr>
+            <w:r>
+              <w:rPr>
+                <w:lang w:val="en-US" w:eastAsia="zh-CN"/>
+              </w:rPr>
+              <w:t>total_order</w:t>
+            </w:r>
+          </w:p>
+        </w:tc>
+        <w:tc>
+          <w:tcPr>
+            <w:tcW w:w="2394" w:type="dxa"/>
+            <w:vAlign w:val="center"/>
+          </w:tcPr>
+          <w:p>
+            <w:pPr>
+              <w:jc w:val="left"/>
+              <w:rPr>
+                <w:rFonts w:hint="default"/>
+                <w:lang w:val="en-US"/>
+              </w:rPr>
+            </w:pPr>
+            <w:r>
+              <w:rPr>
+                <w:lang w:val="en-US" w:eastAsia="zh-CN"/>
+              </w:rPr>
+              <w:t>INT</w:t>
+            </w:r>
+          </w:p>
+        </w:tc>
+        <w:tc>
+          <w:tcPr>
+            <w:tcW w:w="2122" w:type="dxa"/>
+            <w:vAlign w:val="center"/>
+          </w:tcPr>
+          <w:p>
+            <w:pPr>
+              <w:jc w:val="left"/>
+              <w:rPr>
+                <w:rFonts w:hint="default"/>
+                <w:lang w:val="en-US"/>
+              </w:rPr>
+            </w:pPr>
+            <w:r>
+              <w:rPr>
+                <w:lang w:val="en-US" w:eastAsia="zh-CN"/>
+              </w:rPr>
+              <w:t>Tổng đơn hàng</w:t>
+            </w:r>
+          </w:p>
+        </w:tc>
+        <w:tc>
+          <w:tcPr>
+            <w:tcW w:w="2789" w:type="dxa"/>
+            <w:vAlign w:val="center"/>
+          </w:tcPr>
+          <w:p>
+            <w:pPr>
+              <w:jc w:val="left"/>
+              <w:rPr>
+                <w:rFonts w:hint="default"/>
+                <w:lang w:val="en-US"/>
+              </w:rPr>
+            </w:pPr>
+            <w:r>
+              <w:rPr>
+                <w:lang w:val="en-US" w:eastAsia="zh-CN"/>
+              </w:rPr>
+              <w:t>DEFAULT 0</w:t>
+            </w:r>
+          </w:p>
+        </w:tc>
+      </w:tr>
+      <w:tr>
+        <w:tblPrEx>
+          <w:tblBorders>
+            <w:top w:val="single" w:color="auto" w:sz="4" w:space="0"/>
+            <w:left w:val="single" w:color="auto" w:sz="4" w:space="0"/>
+            <w:bottom w:val="single" w:color="auto" w:sz="4" w:space="0"/>
+            <w:right w:val="single" w:color="auto" w:sz="4" w:space="0"/>
+            <w:insideH w:val="single" w:color="auto" w:sz="4" w:space="0"/>
+            <w:insideV w:val="single" w:color="auto" w:sz="4" w:space="0"/>
+          </w:tblBorders>
+          <w:tblCellMar>
+            <w:top w:w="0" w:type="dxa"/>
+            <w:left w:w="108" w:type="dxa"/>
+            <w:bottom w:w="0" w:type="dxa"/>
+            <w:right w:w="108" w:type="dxa"/>
+          </w:tblCellMar>
+        </w:tblPrEx>
+        <w:tc>
+          <w:tcPr>
+            <w:tcW w:w="2564" w:type="dxa"/>
+            <w:vAlign w:val="center"/>
+          </w:tcPr>
+          <w:p>
+            <w:pPr>
+              <w:jc w:val="left"/>
+              <w:rPr>
+                <w:rFonts w:hint="default"/>
+                <w:lang w:val="en-US"/>
+              </w:rPr>
+            </w:pPr>
+            <w:r>
+              <w:rPr>
+                <w:lang w:val="en-US" w:eastAsia="zh-CN"/>
+              </w:rPr>
+              <w:t>loyalty_point</w:t>
+            </w:r>
+          </w:p>
+        </w:tc>
+        <w:tc>
+          <w:tcPr>
+            <w:tcW w:w="2394" w:type="dxa"/>
+            <w:vAlign w:val="center"/>
+          </w:tcPr>
+          <w:p>
+            <w:pPr>
+              <w:jc w:val="left"/>
+              <w:rPr>
+                <w:rFonts w:hint="default"/>
+                <w:lang w:val="en-US"/>
+              </w:rPr>
+            </w:pPr>
+            <w:r>
+              <w:rPr>
+                <w:lang w:val="en-US" w:eastAsia="zh-CN"/>
+              </w:rPr>
+              <w:t>INT</w:t>
+            </w:r>
+          </w:p>
+        </w:tc>
+        <w:tc>
+          <w:tcPr>
+            <w:tcW w:w="2122" w:type="dxa"/>
+            <w:vAlign w:val="center"/>
+          </w:tcPr>
+          <w:p>
+            <w:pPr>
+              <w:jc w:val="left"/>
+              <w:rPr>
+                <w:rFonts w:hint="default"/>
+                <w:lang w:val="en-US"/>
+              </w:rPr>
+            </w:pPr>
+            <w:r>
+              <w:rPr>
+                <w:lang w:val="en-US" w:eastAsia="zh-CN"/>
+              </w:rPr>
+              <w:t>Điểm thưởng</w:t>
+            </w:r>
+          </w:p>
+        </w:tc>
+        <w:tc>
+          <w:tcPr>
+            <w:tcW w:w="2789" w:type="dxa"/>
+            <w:vAlign w:val="center"/>
+          </w:tcPr>
+          <w:p>
+            <w:pPr>
+              <w:jc w:val="left"/>
+              <w:rPr>
+                <w:rFonts w:hint="default"/>
+                <w:lang w:val="en-US"/>
+              </w:rPr>
+            </w:pPr>
+            <w:r>
+              <w:rPr>
+                <w:lang w:val="en-US" w:eastAsia="zh-CN"/>
+              </w:rPr>
+              <w:t>DEFAULT 0</w:t>
+            </w:r>
+          </w:p>
+        </w:tc>
+      </w:tr>
+    </w:tbl>
+    <w:p>
+      <w:pPr>
+        <w:spacing w:line="360" w:lineRule="auto"/>
+        <w:rPr>
+          <w:lang w:val="en-US"/>
+        </w:rPr>
+      </w:pPr>
+      <w:bookmarkStart w:id="113" w:name="_GoBack"/>
+      <w:bookmarkEnd w:id="113"/>
       <w:r>
         <w:rPr>
           <w:lang w:val="en-US"/>
@@ -12046,11 +13556,11 @@
         <w:spacing w:line="360" w:lineRule="auto"/>
       </w:pPr>
       <w:bookmarkStart w:id="78" w:name="_Toc7140"/>
-      <w:bookmarkStart w:id="79" w:name="_Toc11227"/>
-      <w:bookmarkStart w:id="80" w:name="_Toc31434"/>
-      <w:bookmarkStart w:id="81" w:name="_Toc9245"/>
+      <w:bookmarkStart w:id="79" w:name="_Toc31434"/>
+      <w:bookmarkStart w:id="80" w:name="_Toc11227"/>
+      <w:bookmarkStart w:id="81" w:name="_Toc30843"/>
       <w:bookmarkStart w:id="82" w:name="_Toc13107"/>
-      <w:bookmarkStart w:id="83" w:name="_Toc30843"/>
+      <w:bookmarkStart w:id="83" w:name="_Toc9245"/>
       <w:bookmarkStart w:id="84" w:name="_Toc10427"/>
       <w:r>
         <w:t>PHẦN 6 – KIỂM THỬ</w:t>
@@ -12084,11 +13594,11 @@
       </w:pPr>
       <w:bookmarkStart w:id="85" w:name="_Toc25308"/>
       <w:bookmarkStart w:id="86" w:name="_Toc13004"/>
-      <w:bookmarkStart w:id="87" w:name="_Toc17049"/>
+      <w:bookmarkStart w:id="87" w:name="_Toc9907"/>
       <w:bookmarkStart w:id="88" w:name="_Toc20733"/>
-      <w:bookmarkStart w:id="89" w:name="_Toc9907"/>
-      <w:bookmarkStart w:id="90" w:name="_Toc10811"/>
-      <w:bookmarkStart w:id="91" w:name="_Toc18729"/>
+      <w:bookmarkStart w:id="89" w:name="_Toc18729"/>
+      <w:bookmarkStart w:id="90" w:name="_Toc17049"/>
+      <w:bookmarkStart w:id="91" w:name="_Toc10811"/>
       <w:r>
         <w:t>PHẦN 7 – HƯỚNG DẪN TRIỂN KHAI VÀ SỬ DỤNG</w:t>
       </w:r>
@@ -12134,13 +13644,13 @@
         <w:spacing w:line="360" w:lineRule="auto"/>
         <w:outlineLvl w:val="0"/>
       </w:pPr>
-      <w:bookmarkStart w:id="92" w:name="_Toc8669"/>
-      <w:bookmarkStart w:id="93" w:name="_Toc13850"/>
-      <w:bookmarkStart w:id="94" w:name="_Toc12999"/>
-      <w:bookmarkStart w:id="95" w:name="_Toc26678"/>
-      <w:bookmarkStart w:id="96" w:name="_Toc14589"/>
-      <w:bookmarkStart w:id="97" w:name="_Toc12063"/>
-      <w:bookmarkStart w:id="98" w:name="_Toc30879"/>
+      <w:bookmarkStart w:id="92" w:name="_Toc13850"/>
+      <w:bookmarkStart w:id="93" w:name="_Toc26678"/>
+      <w:bookmarkStart w:id="94" w:name="_Toc14589"/>
+      <w:bookmarkStart w:id="95" w:name="_Toc8669"/>
+      <w:bookmarkStart w:id="96" w:name="_Toc12063"/>
+      <w:bookmarkStart w:id="97" w:name="_Toc30879"/>
+      <w:bookmarkStart w:id="98" w:name="_Toc12999"/>
       <w:r>
         <w:t>KẾT LUẬN</w:t>
       </w:r>
@@ -12186,13 +13696,13 @@
         <w:spacing w:line="360" w:lineRule="auto"/>
         <w:outlineLvl w:val="0"/>
       </w:pPr>
-      <w:bookmarkStart w:id="99" w:name="_Toc26685"/>
-      <w:bookmarkStart w:id="100" w:name="_Toc13001"/>
+      <w:bookmarkStart w:id="99" w:name="_Toc21750"/>
+      <w:bookmarkStart w:id="100" w:name="_Toc26685"/>
       <w:bookmarkStart w:id="101" w:name="_Toc25563"/>
       <w:bookmarkStart w:id="102" w:name="_Toc25259"/>
-      <w:bookmarkStart w:id="103" w:name="_Toc10803"/>
-      <w:bookmarkStart w:id="104" w:name="_Toc21750"/>
-      <w:bookmarkStart w:id="105" w:name="_Toc9646"/>
+      <w:bookmarkStart w:id="103" w:name="_Toc9646"/>
+      <w:bookmarkStart w:id="104" w:name="_Toc10803"/>
+      <w:bookmarkStart w:id="105" w:name="_Toc13001"/>
       <w:r>
         <w:t>PHỤ LỤC</w:t>
       </w:r>
@@ -12210,13 +13720,13 @@
         <w:spacing w:line="360" w:lineRule="auto"/>
         <w:outlineLvl w:val="0"/>
       </w:pPr>
-      <w:bookmarkStart w:id="106" w:name="_Toc15530"/>
-      <w:bookmarkStart w:id="107" w:name="_Toc19685"/>
-      <w:bookmarkStart w:id="108" w:name="_Toc630"/>
-      <w:bookmarkStart w:id="109" w:name="_Toc9694"/>
-      <w:bookmarkStart w:id="110" w:name="_Toc21248"/>
-      <w:bookmarkStart w:id="111" w:name="_Toc32021"/>
-      <w:bookmarkStart w:id="112" w:name="_Toc25373"/>
+      <w:bookmarkStart w:id="106" w:name="_Toc630"/>
+      <w:bookmarkStart w:id="107" w:name="_Toc9694"/>
+      <w:bookmarkStart w:id="108" w:name="_Toc32021"/>
+      <w:bookmarkStart w:id="109" w:name="_Toc25373"/>
+      <w:bookmarkStart w:id="110" w:name="_Toc19685"/>
+      <w:bookmarkStart w:id="111" w:name="_Toc15530"/>
+      <w:bookmarkStart w:id="112" w:name="_Toc21248"/>
       <w:r>
         <w:t>TÀI LIỆU THAM KHẢO</w:t>
       </w:r>

</xml_diff>